<commit_message>
Fase 2: evidencia de base de datos
</commit_message>
<xml_diff>
--- a/Fase 2/Evidencias Proyecto/Evidencias de sistema/Base de datos/EvidenciaBaseDeDatos_Fase2.docx
+++ b/Fase 2/Evidencias Proyecto/Evidencias de sistema/Base de datos/EvidenciaBaseDeDatos_Fase2.docx
@@ -73,7 +73,7 @@
           <w:b w:val="0"/>
           <w:sz w:val="20"/>
         </w:rPr>
-        <w:t>Profesor: Carlos Andrés Herrera Machuca          Fecha: 15 de octubre de 2026</w:t>
+        <w:t>Profesor: Carlos Andrés Herrera Machuca          Fecha: 14 de octubre de 2026</w:t>
       </w:r>
     </w:p>
     <w:p>
@@ -107,26 +107,64 @@
       </w:r>
     </w:p>
     <w:p>
+      <w:pPr>
+        <w:jc w:val="both"/>
+      </w:pPr>
       <w:r>
         <w:rPr>
           <w:rFonts w:ascii="Arial" w:hAnsi="Arial"/>
-          <w:b/>
+          <w:b w:val="0"/>
           <w:sz w:val="22"/>
         </w:rPr>
-        <w:t>Comando ejecutado:</w:t>
+        <w:t>A continuación se adjunta la captura de la consulta ejecutada sobre el contenedor de base de datos, en la que se observan las doce tablas del esquema junto con la cantidad de campos de cada una.</w:t>
+      </w:r>
+    </w:p>
+    <w:p>
+      <w:r>
+        <w:rPr>
+          <w:rFonts w:ascii="Arial" w:hAnsi="Arial"/>
+          <w:b w:val="0"/>
+          <w:sz w:val="22"/>
+        </w:rPr>
       </w:r>
     </w:p>
     <w:p>
       <w:pPr>
-        <w:spacing w:after="0"/>
+        <w:jc w:val="center"/>
       </w:pPr>
       <w:r>
-        <w:rPr>
-          <w:rFonts w:ascii="Consolas" w:hAnsi="Consolas"/>
-          <w:b w:val="0"/>
-          <w:sz w:val="18"/>
-        </w:rPr>
-        <w:t>docker compose exec -T db psql -U asiistente -d asiistente -c "\dt"</w:t>
+        <w:drawing>
+          <wp:inline xmlns:a="http://schemas.openxmlformats.org/drawingml/2006/main" xmlns:pic="http://schemas.openxmlformats.org/drawingml/2006/picture">
+            <wp:extent cx="5400000" cy="2139735"/>
+            <wp:docPr id="1" name="Picture 1"/>
+            <wp:cNvGraphicFramePr>
+              <a:graphicFrameLocks noChangeAspect="1"/>
+            </wp:cNvGraphicFramePr>
+            <a:graphic>
+              <a:graphicData uri="http://schemas.openxmlformats.org/drawingml/2006/picture">
+                <pic:pic>
+                  <pic:nvPicPr>
+                    <pic:cNvPr id="0" name="captura_bd.png"/>
+                    <pic:cNvPicPr/>
+                  </pic:nvPicPr>
+                  <pic:blipFill>
+                    <a:blip r:embed="rId9"/>
+                    <a:stretch>
+                      <a:fillRect/>
+                    </a:stretch>
+                  </pic:blipFill>
+                  <pic:spPr>
+                    <a:xfrm>
+                      <a:off x="0" y="0"/>
+                      <a:ext cx="5400000" cy="2139735"/>
+                    </a:xfrm>
+                    <a:prstGeom prst="rect"/>
+                  </pic:spPr>
+                </pic:pic>
+              </a:graphicData>
+            </a:graphic>
+          </wp:inline>
+        </w:drawing>
       </w:r>
     </w:p>
     <w:p>

</xml_diff>